<commit_message>
modify the report file for explain the end of html
</commit_message>
<xml_diff>
--- a/Créer un site web HTML CSS Bootstrap [Laurent Bourcin].docx
+++ b/Créer un site web HTML CSS Bootstrap [Laurent Bourcin].docx
@@ -535,230 +535,6 @@
           <w:shd w:fill="auto" w:val="clear"/>
         </w:rPr>
       </w:pPr>
-    </w:p>
-    <w:p>
-      <w:pPr>
-        <w:spacing w:before="0" w:after="0" w:line="240"/>
-        <w:ind w:right="0" w:left="0" w:firstLine="0"/>
-        <w:jc w:val="both"/>
-        <w:rPr>
-          <w:rFonts w:ascii="Calibri" w:hAnsi="Calibri" w:cs="Calibri" w:eastAsia="Calibri"/>
-          <w:color w:val="000000"/>
-          <w:spacing w:val="0"/>
-          <w:position w:val="0"/>
-          <w:sz w:val="21"/>
-          <w:shd w:fill="auto" w:val="clear"/>
-        </w:rPr>
-      </w:pPr>
-    </w:p>
-    <w:p>
-      <w:pPr>
-        <w:spacing w:before="0" w:after="0" w:line="240"/>
-        <w:ind w:right="0" w:left="0" w:firstLine="0"/>
-        <w:jc w:val="both"/>
-        <w:rPr>
-          <w:rFonts w:ascii="Calibri" w:hAnsi="Calibri" w:cs="Calibri" w:eastAsia="Calibri"/>
-          <w:color w:val="000000"/>
-          <w:spacing w:val="0"/>
-          <w:position w:val="0"/>
-          <w:sz w:val="21"/>
-          <w:shd w:fill="auto" w:val="clear"/>
-        </w:rPr>
-      </w:pPr>
-    </w:p>
-    <w:p>
-      <w:pPr>
-        <w:spacing w:before="0" w:after="0" w:line="240"/>
-        <w:ind w:right="0" w:left="0" w:firstLine="0"/>
-        <w:jc w:val="both"/>
-        <w:rPr>
-          <w:rFonts w:ascii="Calibri" w:hAnsi="Calibri" w:cs="Calibri" w:eastAsia="Calibri"/>
-          <w:color w:val="000000"/>
-          <w:spacing w:val="0"/>
-          <w:position w:val="0"/>
-          <w:sz w:val="21"/>
-          <w:shd w:fill="auto" w:val="clear"/>
-        </w:rPr>
-      </w:pPr>
-    </w:p>
-    <w:p>
-      <w:pPr>
-        <w:spacing w:before="0" w:after="0" w:line="240"/>
-        <w:ind w:right="0" w:left="0" w:firstLine="0"/>
-        <w:jc w:val="both"/>
-        <w:rPr>
-          <w:rFonts w:ascii="Calibri" w:hAnsi="Calibri" w:cs="Calibri" w:eastAsia="Calibri"/>
-          <w:color w:val="000000"/>
-          <w:spacing w:val="0"/>
-          <w:position w:val="0"/>
-          <w:sz w:val="21"/>
-          <w:shd w:fill="auto" w:val="clear"/>
-        </w:rPr>
-      </w:pPr>
-    </w:p>
-    <w:p>
-      <w:pPr>
-        <w:spacing w:before="0" w:after="0" w:line="240"/>
-        <w:ind w:right="0" w:left="0" w:firstLine="0"/>
-        <w:jc w:val="both"/>
-        <w:rPr>
-          <w:rFonts w:ascii="Calibri" w:hAnsi="Calibri" w:cs="Calibri" w:eastAsia="Calibri"/>
-          <w:color w:val="000000"/>
-          <w:spacing w:val="0"/>
-          <w:position w:val="0"/>
-          <w:sz w:val="21"/>
-          <w:shd w:fill="auto" w:val="clear"/>
-        </w:rPr>
-      </w:pPr>
-    </w:p>
-    <w:p>
-      <w:pPr>
-        <w:numPr>
-          <w:ilvl w:val="0"/>
-          <w:numId w:val="8"/>
-        </w:numPr>
-        <w:spacing w:before="0" w:after="0" w:line="240"/>
-        <w:ind w:right="0" w:left="720" w:hanging="360"/>
-        <w:jc w:val="both"/>
-        <w:rPr>
-          <w:rFonts w:ascii="Calibri" w:hAnsi="Calibri" w:cs="Calibri" w:eastAsia="Calibri"/>
-          <w:color w:val="000000"/>
-          <w:spacing w:val="0"/>
-          <w:position w:val="0"/>
-          <w:sz w:val="21"/>
-          <w:shd w:fill="auto" w:val="clear"/>
-        </w:rPr>
-      </w:pPr>
-      <w:r>
-        <w:rPr>
-          <w:rFonts w:ascii="Calibri" w:hAnsi="Calibri" w:cs="Calibri" w:eastAsia="Calibri"/>
-          <w:color w:val="000000"/>
-          <w:spacing w:val="0"/>
-          <w:position w:val="0"/>
-          <w:sz w:val="21"/>
-          <w:shd w:fill="auto" w:val="clear"/>
-        </w:rPr>
-        <w:t xml:space="preserve">Précisez les moyens utilisés. Expliquez tout ce dont vous avez eu besoin pour réaliser vos tâches : langages de programmation, frameworks, outils, logiciels, documentations techniques, etc...</w:t>
-      </w:r>
-    </w:p>
-    <w:p>
-      <w:pPr>
-        <w:spacing w:before="0" w:after="0" w:line="240"/>
-        <w:ind w:right="0" w:left="0" w:firstLine="0"/>
-        <w:jc w:val="both"/>
-        <w:rPr>
-          <w:rFonts w:ascii="Calibri" w:hAnsi="Calibri" w:cs="Calibri" w:eastAsia="Calibri"/>
-          <w:color w:val="000000"/>
-          <w:spacing w:val="0"/>
-          <w:position w:val="0"/>
-          <w:sz w:val="21"/>
-          <w:shd w:fill="auto" w:val="clear"/>
-        </w:rPr>
-      </w:pPr>
-      <w:r>
-        <w:rPr>
-          <w:rFonts w:ascii="Calibri" w:hAnsi="Calibri" w:cs="Calibri" w:eastAsia="Calibri"/>
-          <w:color w:val="000000"/>
-          <w:spacing w:val="0"/>
-          <w:position w:val="0"/>
-          <w:sz w:val="21"/>
-          <w:shd w:fill="auto" w:val="clear"/>
-        </w:rPr>
-        <w:t xml:space="preserve">1. Utilisation de Github via Git Bash, pour développer le projet, conserver son historique et permettre au correcteur d'avoir l'ensemble des informations.</w:t>
-      </w:r>
-    </w:p>
-    <w:p>
-      <w:pPr>
-        <w:spacing w:before="0" w:after="0" w:line="240"/>
-        <w:ind w:right="0" w:left="0" w:firstLine="0"/>
-        <w:jc w:val="both"/>
-        <w:rPr>
-          <w:rFonts w:ascii="Calibri" w:hAnsi="Calibri" w:cs="Calibri" w:eastAsia="Calibri"/>
-          <w:color w:val="000000"/>
-          <w:spacing w:val="0"/>
-          <w:position w:val="0"/>
-          <w:sz w:val="21"/>
-          <w:shd w:fill="auto" w:val="clear"/>
-        </w:rPr>
-      </w:pPr>
-      <w:r>
-        <w:rPr>
-          <w:rFonts w:ascii="Calibri" w:hAnsi="Calibri" w:cs="Calibri" w:eastAsia="Calibri"/>
-          <w:color w:val="000000"/>
-          <w:spacing w:val="0"/>
-          <w:position w:val="0"/>
-          <w:sz w:val="21"/>
-          <w:shd w:fill="auto" w:val="clear"/>
-        </w:rPr>
-        <w:t xml:space="preserve">2. Utilisation du language de description HTML, afin d'ossaturer le projet de site web.</w:t>
-      </w:r>
-    </w:p>
-    <w:p>
-      <w:pPr>
-        <w:spacing w:before="0" w:after="0" w:line="240"/>
-        <w:ind w:right="0" w:left="0" w:firstLine="0"/>
-        <w:jc w:val="both"/>
-        <w:rPr>
-          <w:rFonts w:ascii="Calibri" w:hAnsi="Calibri" w:cs="Calibri" w:eastAsia="Calibri"/>
-          <w:color w:val="000000"/>
-          <w:spacing w:val="0"/>
-          <w:position w:val="0"/>
-          <w:sz w:val="21"/>
-          <w:shd w:fill="auto" w:val="clear"/>
-        </w:rPr>
-      </w:pPr>
-      <w:r>
-        <w:rPr>
-          <w:rFonts w:ascii="Calibri" w:hAnsi="Calibri" w:cs="Calibri" w:eastAsia="Calibri"/>
-          <w:color w:val="000000"/>
-          <w:spacing w:val="0"/>
-          <w:position w:val="0"/>
-          <w:sz w:val="21"/>
-          <w:shd w:fill="auto" w:val="clear"/>
-        </w:rPr>
-        <w:t xml:space="preserve">3. Pour cela, utilisation de l'IDE Visual Studio Code.</w:t>
-      </w:r>
-    </w:p>
-    <w:p>
-      <w:pPr>
-        <w:spacing w:before="0" w:after="0" w:line="240"/>
-        <w:ind w:right="0" w:left="0" w:firstLine="0"/>
-        <w:jc w:val="both"/>
-        <w:rPr>
-          <w:rFonts w:ascii="Calibri" w:hAnsi="Calibri" w:cs="Calibri" w:eastAsia="Calibri"/>
-          <w:color w:val="000000"/>
-          <w:spacing w:val="0"/>
-          <w:position w:val="0"/>
-          <w:sz w:val="21"/>
-          <w:shd w:fill="auto" w:val="clear"/>
-        </w:rPr>
-      </w:pPr>
-      <w:r>
-        <w:rPr>
-          <w:rFonts w:ascii="Calibri" w:hAnsi="Calibri" w:cs="Calibri" w:eastAsia="Calibri"/>
-          <w:color w:val="000000"/>
-          <w:spacing w:val="0"/>
-          <w:position w:val="0"/>
-          <w:sz w:val="21"/>
-          <w:shd w:fill="auto" w:val="clear"/>
-        </w:rPr>
-        <w:t xml:space="preserve">4. Utilisation d'Inkscape pour modéliser la page web voulue et pour la conception du logo.</w:t>
-      </w:r>
-    </w:p>
-    <w:p>
-      <w:pPr>
-        <w:spacing w:before="0" w:after="0" w:line="240"/>
-        <w:ind w:right="0" w:left="0" w:firstLine="0"/>
-        <w:jc w:val="both"/>
-        <w:rPr>
-          <w:rFonts w:ascii="Calibri" w:hAnsi="Calibri" w:cs="Calibri" w:eastAsia="Calibri"/>
-          <w:color w:val="000000"/>
-          <w:spacing w:val="0"/>
-          <w:position w:val="0"/>
-          <w:sz w:val="21"/>
-          <w:shd w:fill="auto" w:val="clear"/>
-        </w:rPr>
-      </w:pPr>
       <w:r>
         <w:rPr>
           <w:rFonts w:ascii="Calibri" w:hAnsi="Calibri" w:cs="Calibri" w:eastAsia="Calibri"/>
@@ -821,6 +597,32 @@
           <w:shd w:fill="auto" w:val="clear"/>
         </w:rPr>
         <w:t xml:space="preserve">7. Conception de toute la partie html, sans style, avec un main et un footer (et ajout de logos comme pour le header).</w:t>
+      </w:r>
+    </w:p>
+    <w:p>
+      <w:pPr>
+        <w:spacing w:before="0" w:after="0" w:line="240"/>
+        <w:ind w:right="0" w:left="0" w:firstLine="0"/>
+        <w:jc w:val="both"/>
+        <w:rPr>
+          <w:rFonts w:ascii="Calibri" w:hAnsi="Calibri" w:cs="Calibri" w:eastAsia="Calibri"/>
+          <w:color w:val="000000"/>
+          <w:spacing w:val="0"/>
+          <w:position w:val="0"/>
+          <w:sz w:val="21"/>
+          <w:shd w:fill="auto" w:val="clear"/>
+        </w:rPr>
+      </w:pPr>
+      <w:r>
+        <w:rPr>
+          <w:rFonts w:ascii="Calibri" w:hAnsi="Calibri" w:cs="Calibri" w:eastAsia="Calibri"/>
+          <w:color w:val="000000"/>
+          <w:spacing w:val="0"/>
+          <w:position w:val="0"/>
+          <w:sz w:val="21"/>
+          <w:shd w:fill="auto" w:val="clear"/>
+        </w:rPr>
+        <w:t xml:space="preserve">8. Merge de la branche "html" à la branche "main" principale, la partie html pure étant finie.</w:t>
       </w:r>
     </w:p>
     <w:p>
@@ -910,124 +712,112 @@
           <w:sz w:val="21"/>
           <w:shd w:fill="auto" w:val="clear"/>
         </w:rPr>
-        <w:t xml:space="preserve">Contexte. Les noms des organismes, entreprises ou associations, dans lesquels vous avez exercé vos pratiques.</w:t>
-      </w:r>
-    </w:p>
-    <w:p>
-      <w:pPr>
-        <w:spacing w:before="0" w:after="0" w:line="240"/>
-        <w:ind w:right="0" w:left="360" w:firstLine="360"/>
-        <w:jc w:val="both"/>
-        <w:rPr>
-          <w:rFonts w:ascii="Calibri" w:hAnsi="Calibri" w:cs="Calibri" w:eastAsia="Calibri"/>
-          <w:color w:val="000000"/>
-          <w:spacing w:val="0"/>
-          <w:position w:val="0"/>
-          <w:sz w:val="21"/>
-          <w:shd w:fill="auto" w:val="clear"/>
-        </w:rPr>
-      </w:pPr>
-      <w:r>
-        <w:rPr>
-          <w:rFonts w:ascii="Calibri" w:hAnsi="Calibri" w:cs="Calibri" w:eastAsia="Calibri"/>
-          <w:color w:val="000000"/>
-          <w:spacing w:val="0"/>
-          <w:position w:val="0"/>
-          <w:sz w:val="21"/>
-          <w:shd w:fill="auto" w:val="clear"/>
-        </w:rPr>
-        <w:t xml:space="preserve">NB: Pour le cas des exercices et évaluations demandées sur la plateforme Studi, il s'agit de...Studi.</w:t>
-      </w:r>
-    </w:p>
-    <w:p>
-      <w:pPr>
-        <w:spacing w:before="0" w:after="0" w:line="240"/>
-        <w:ind w:right="0" w:left="0" w:firstLine="0"/>
-        <w:jc w:val="both"/>
-        <w:rPr>
-          <w:rFonts w:ascii="Calibri" w:hAnsi="Calibri" w:cs="Calibri" w:eastAsia="Calibri"/>
-          <w:color w:val="000000"/>
-          <w:spacing w:val="0"/>
-          <w:position w:val="0"/>
-          <w:sz w:val="21"/>
-          <w:shd w:fill="auto" w:val="clear"/>
-        </w:rPr>
-      </w:pPr>
-    </w:p>
-    <w:p>
-      <w:pPr>
-        <w:spacing w:before="0" w:after="0" w:line="240"/>
-        <w:ind w:right="0" w:left="0" w:firstLine="0"/>
-        <w:jc w:val="both"/>
-        <w:rPr>
-          <w:rFonts w:ascii="Calibri" w:hAnsi="Calibri" w:cs="Calibri" w:eastAsia="Calibri"/>
-          <w:color w:val="000000"/>
-          <w:spacing w:val="0"/>
-          <w:position w:val="0"/>
-          <w:sz w:val="21"/>
-          <w:shd w:fill="auto" w:val="clear"/>
-        </w:rPr>
-      </w:pPr>
-    </w:p>
-    <w:p>
-      <w:pPr>
-        <w:spacing w:before="0" w:after="0" w:line="240"/>
-        <w:ind w:right="0" w:left="0" w:firstLine="0"/>
-        <w:jc w:val="both"/>
-        <w:rPr>
-          <w:rFonts w:ascii="Calibri" w:hAnsi="Calibri" w:cs="Calibri" w:eastAsia="Calibri"/>
-          <w:color w:val="000000"/>
-          <w:spacing w:val="0"/>
-          <w:position w:val="0"/>
-          <w:sz w:val="21"/>
-          <w:shd w:fill="auto" w:val="clear"/>
-        </w:rPr>
-      </w:pPr>
-    </w:p>
-    <w:p>
-      <w:pPr>
-        <w:spacing w:before="0" w:after="0" w:line="240"/>
-        <w:ind w:right="0" w:left="0" w:firstLine="0"/>
-        <w:jc w:val="both"/>
-        <w:rPr>
-          <w:rFonts w:ascii="Calibri" w:hAnsi="Calibri" w:cs="Calibri" w:eastAsia="Calibri"/>
-          <w:color w:val="000000"/>
-          <w:spacing w:val="0"/>
-          <w:position w:val="0"/>
-          <w:sz w:val="21"/>
-          <w:shd w:fill="auto" w:val="clear"/>
-        </w:rPr>
-      </w:pPr>
-    </w:p>
-    <w:p>
-      <w:pPr>
-        <w:spacing w:before="0" w:after="0" w:line="240"/>
-        <w:ind w:right="0" w:left="0" w:firstLine="0"/>
-        <w:jc w:val="both"/>
-        <w:rPr>
-          <w:rFonts w:ascii="Calibri" w:hAnsi="Calibri" w:cs="Calibri" w:eastAsia="Calibri"/>
-          <w:color w:val="000000"/>
-          <w:spacing w:val="0"/>
-          <w:position w:val="0"/>
-          <w:sz w:val="21"/>
-          <w:shd w:fill="auto" w:val="clear"/>
-        </w:rPr>
-      </w:pPr>
-    </w:p>
-    <w:p>
-      <w:pPr>
-        <w:spacing w:before="0" w:after="0" w:line="240"/>
-        <w:ind w:right="0" w:left="0" w:firstLine="0"/>
-        <w:jc w:val="both"/>
-        <w:rPr>
-          <w:rFonts w:ascii="Calibri" w:hAnsi="Calibri" w:cs="Calibri" w:eastAsia="Calibri"/>
-          <w:color w:val="000000"/>
-          <w:spacing w:val="0"/>
-          <w:position w:val="0"/>
-          <w:sz w:val="21"/>
-          <w:shd w:fill="auto" w:val="clear"/>
-        </w:rPr>
-      </w:pPr>
+        <w:t xml:space="preserve">Précisez les moyens utilisés. Expliquez tout ce dont vous avez eu besoin pour réaliser vos tâches : langages de programmation, frameworks, outils, logiciels, documentations techniques, etc...</w:t>
+      </w:r>
+    </w:p>
+    <w:p>
+      <w:pPr>
+        <w:spacing w:before="0" w:after="0" w:line="240"/>
+        <w:ind w:right="0" w:left="0" w:firstLine="0"/>
+        <w:jc w:val="both"/>
+        <w:rPr>
+          <w:rFonts w:ascii="Calibri" w:hAnsi="Calibri" w:cs="Calibri" w:eastAsia="Calibri"/>
+          <w:color w:val="000000"/>
+          <w:spacing w:val="0"/>
+          <w:position w:val="0"/>
+          <w:sz w:val="21"/>
+          <w:shd w:fill="auto" w:val="clear"/>
+        </w:rPr>
+      </w:pPr>
+      <w:r>
+        <w:rPr>
+          <w:rFonts w:ascii="Calibri" w:hAnsi="Calibri" w:cs="Calibri" w:eastAsia="Calibri"/>
+          <w:color w:val="000000"/>
+          <w:spacing w:val="0"/>
+          <w:position w:val="0"/>
+          <w:sz w:val="21"/>
+          <w:shd w:fill="auto" w:val="clear"/>
+        </w:rPr>
+        <w:t xml:space="preserve">1. Utilisation de Github via Git Bash, pour développer le projet, conserver son historique et permettre au correcteur d'avoir l'ensemble des informations.</w:t>
+      </w:r>
+    </w:p>
+    <w:p>
+      <w:pPr>
+        <w:spacing w:before="0" w:after="0" w:line="240"/>
+        <w:ind w:right="0" w:left="0" w:firstLine="0"/>
+        <w:jc w:val="both"/>
+        <w:rPr>
+          <w:rFonts w:ascii="Calibri" w:hAnsi="Calibri" w:cs="Calibri" w:eastAsia="Calibri"/>
+          <w:color w:val="000000"/>
+          <w:spacing w:val="0"/>
+          <w:position w:val="0"/>
+          <w:sz w:val="21"/>
+          <w:shd w:fill="auto" w:val="clear"/>
+        </w:rPr>
+      </w:pPr>
+      <w:r>
+        <w:rPr>
+          <w:rFonts w:ascii="Calibri" w:hAnsi="Calibri" w:cs="Calibri" w:eastAsia="Calibri"/>
+          <w:color w:val="000000"/>
+          <w:spacing w:val="0"/>
+          <w:position w:val="0"/>
+          <w:sz w:val="21"/>
+          <w:shd w:fill="auto" w:val="clear"/>
+        </w:rPr>
+        <w:t xml:space="preserve">2. Utilisation du language de description HTML, afin d'ossaturer le projet de site web.</w:t>
+      </w:r>
+    </w:p>
+    <w:p>
+      <w:pPr>
+        <w:spacing w:before="0" w:after="0" w:line="240"/>
+        <w:ind w:right="0" w:left="0" w:firstLine="0"/>
+        <w:jc w:val="both"/>
+        <w:rPr>
+          <w:rFonts w:ascii="Calibri" w:hAnsi="Calibri" w:cs="Calibri" w:eastAsia="Calibri"/>
+          <w:color w:val="000000"/>
+          <w:spacing w:val="0"/>
+          <w:position w:val="0"/>
+          <w:sz w:val="21"/>
+          <w:shd w:fill="auto" w:val="clear"/>
+        </w:rPr>
+      </w:pPr>
+      <w:r>
+        <w:rPr>
+          <w:rFonts w:ascii="Calibri" w:hAnsi="Calibri" w:cs="Calibri" w:eastAsia="Calibri"/>
+          <w:color w:val="000000"/>
+          <w:spacing w:val="0"/>
+          <w:position w:val="0"/>
+          <w:sz w:val="21"/>
+          <w:shd w:fill="auto" w:val="clear"/>
+        </w:rPr>
+        <w:t xml:space="preserve">3. Pour cela, utilisation de l'IDE Visual Studio Code.</w:t>
+      </w:r>
+    </w:p>
+    <w:p>
+      <w:pPr>
+        <w:spacing w:before="0" w:after="0" w:line="240"/>
+        <w:ind w:right="0" w:left="0" w:firstLine="0"/>
+        <w:jc w:val="both"/>
+        <w:rPr>
+          <w:rFonts w:ascii="Calibri" w:hAnsi="Calibri" w:cs="Calibri" w:eastAsia="Calibri"/>
+          <w:color w:val="000000"/>
+          <w:spacing w:val="0"/>
+          <w:position w:val="0"/>
+          <w:sz w:val="21"/>
+          <w:shd w:fill="auto" w:val="clear"/>
+        </w:rPr>
+      </w:pPr>
+      <w:r>
+        <w:rPr>
+          <w:rFonts w:ascii="Calibri" w:hAnsi="Calibri" w:cs="Calibri" w:eastAsia="Calibri"/>
+          <w:color w:val="000000"/>
+          <w:spacing w:val="0"/>
+          <w:position w:val="0"/>
+          <w:sz w:val="21"/>
+          <w:shd w:fill="auto" w:val="clear"/>
+        </w:rPr>
+        <w:t xml:space="preserve">4. Utilisation d'Inkscape pour modéliser la page web voulue et pour la conception du logo.</w:t>
+      </w:r>
     </w:p>
     <w:p>
       <w:pPr>
@@ -1093,7 +883,213 @@
       <w:pPr>
         <w:numPr>
           <w:ilvl w:val="0"/>
-          <w:numId w:val="13"/>
+          <w:numId w:val="12"/>
+        </w:numPr>
+        <w:spacing w:before="0" w:after="0" w:line="240"/>
+        <w:ind w:right="0" w:left="720" w:hanging="360"/>
+        <w:jc w:val="both"/>
+        <w:rPr>
+          <w:rFonts w:ascii="Calibri" w:hAnsi="Calibri" w:cs="Calibri" w:eastAsia="Calibri"/>
+          <w:color w:val="000000"/>
+          <w:spacing w:val="0"/>
+          <w:position w:val="0"/>
+          <w:sz w:val="21"/>
+          <w:shd w:fill="auto" w:val="clear"/>
+        </w:rPr>
+      </w:pPr>
+      <w:r>
+        <w:rPr>
+          <w:rFonts w:ascii="Calibri" w:hAnsi="Calibri" w:cs="Calibri" w:eastAsia="Calibri"/>
+          <w:color w:val="000000"/>
+          <w:spacing w:val="0"/>
+          <w:position w:val="0"/>
+          <w:sz w:val="21"/>
+          <w:shd w:fill="auto" w:val="clear"/>
+        </w:rPr>
+        <w:t xml:space="preserve">Contexte. Les noms des organismes, entreprises ou associations, dans lesquels vous avez exercé vos pratiques.</w:t>
+      </w:r>
+    </w:p>
+    <w:p>
+      <w:pPr>
+        <w:spacing w:before="0" w:after="0" w:line="240"/>
+        <w:ind w:right="0" w:left="360" w:firstLine="360"/>
+        <w:jc w:val="both"/>
+        <w:rPr>
+          <w:rFonts w:ascii="Calibri" w:hAnsi="Calibri" w:cs="Calibri" w:eastAsia="Calibri"/>
+          <w:color w:val="000000"/>
+          <w:spacing w:val="0"/>
+          <w:position w:val="0"/>
+          <w:sz w:val="21"/>
+          <w:shd w:fill="auto" w:val="clear"/>
+        </w:rPr>
+      </w:pPr>
+      <w:r>
+        <w:rPr>
+          <w:rFonts w:ascii="Calibri" w:hAnsi="Calibri" w:cs="Calibri" w:eastAsia="Calibri"/>
+          <w:color w:val="000000"/>
+          <w:spacing w:val="0"/>
+          <w:position w:val="0"/>
+          <w:sz w:val="21"/>
+          <w:shd w:fill="auto" w:val="clear"/>
+        </w:rPr>
+        <w:t xml:space="preserve">NB: Pour le cas des exercices et évaluations demandées sur la plateforme Studi, il s'agit de...Studi.</w:t>
+      </w:r>
+    </w:p>
+    <w:p>
+      <w:pPr>
+        <w:spacing w:before="0" w:after="0" w:line="240"/>
+        <w:ind w:right="0" w:left="0" w:firstLine="0"/>
+        <w:jc w:val="both"/>
+        <w:rPr>
+          <w:rFonts w:ascii="Calibri" w:hAnsi="Calibri" w:cs="Calibri" w:eastAsia="Calibri"/>
+          <w:color w:val="000000"/>
+          <w:spacing w:val="0"/>
+          <w:position w:val="0"/>
+          <w:sz w:val="21"/>
+          <w:shd w:fill="auto" w:val="clear"/>
+        </w:rPr>
+      </w:pPr>
+    </w:p>
+    <w:p>
+      <w:pPr>
+        <w:spacing w:before="0" w:after="0" w:line="240"/>
+        <w:ind w:right="0" w:left="0" w:firstLine="0"/>
+        <w:jc w:val="both"/>
+        <w:rPr>
+          <w:rFonts w:ascii="Calibri" w:hAnsi="Calibri" w:cs="Calibri" w:eastAsia="Calibri"/>
+          <w:color w:val="000000"/>
+          <w:spacing w:val="0"/>
+          <w:position w:val="0"/>
+          <w:sz w:val="21"/>
+          <w:shd w:fill="auto" w:val="clear"/>
+        </w:rPr>
+      </w:pPr>
+    </w:p>
+    <w:p>
+      <w:pPr>
+        <w:spacing w:before="0" w:after="0" w:line="240"/>
+        <w:ind w:right="0" w:left="0" w:firstLine="0"/>
+        <w:jc w:val="both"/>
+        <w:rPr>
+          <w:rFonts w:ascii="Calibri" w:hAnsi="Calibri" w:cs="Calibri" w:eastAsia="Calibri"/>
+          <w:color w:val="000000"/>
+          <w:spacing w:val="0"/>
+          <w:position w:val="0"/>
+          <w:sz w:val="21"/>
+          <w:shd w:fill="auto" w:val="clear"/>
+        </w:rPr>
+      </w:pPr>
+    </w:p>
+    <w:p>
+      <w:pPr>
+        <w:spacing w:before="0" w:after="0" w:line="240"/>
+        <w:ind w:right="0" w:left="0" w:firstLine="0"/>
+        <w:jc w:val="both"/>
+        <w:rPr>
+          <w:rFonts w:ascii="Calibri" w:hAnsi="Calibri" w:cs="Calibri" w:eastAsia="Calibri"/>
+          <w:color w:val="000000"/>
+          <w:spacing w:val="0"/>
+          <w:position w:val="0"/>
+          <w:sz w:val="21"/>
+          <w:shd w:fill="auto" w:val="clear"/>
+        </w:rPr>
+      </w:pPr>
+    </w:p>
+    <w:p>
+      <w:pPr>
+        <w:spacing w:before="0" w:after="0" w:line="240"/>
+        <w:ind w:right="0" w:left="0" w:firstLine="0"/>
+        <w:jc w:val="both"/>
+        <w:rPr>
+          <w:rFonts w:ascii="Calibri" w:hAnsi="Calibri" w:cs="Calibri" w:eastAsia="Calibri"/>
+          <w:color w:val="000000"/>
+          <w:spacing w:val="0"/>
+          <w:position w:val="0"/>
+          <w:sz w:val="21"/>
+          <w:shd w:fill="auto" w:val="clear"/>
+        </w:rPr>
+      </w:pPr>
+    </w:p>
+    <w:p>
+      <w:pPr>
+        <w:spacing w:before="0" w:after="0" w:line="240"/>
+        <w:ind w:right="0" w:left="0" w:firstLine="0"/>
+        <w:jc w:val="both"/>
+        <w:rPr>
+          <w:rFonts w:ascii="Calibri" w:hAnsi="Calibri" w:cs="Calibri" w:eastAsia="Calibri"/>
+          <w:color w:val="000000"/>
+          <w:spacing w:val="0"/>
+          <w:position w:val="0"/>
+          <w:sz w:val="21"/>
+          <w:shd w:fill="auto" w:val="clear"/>
+        </w:rPr>
+      </w:pPr>
+    </w:p>
+    <w:p>
+      <w:pPr>
+        <w:spacing w:before="0" w:after="0" w:line="240"/>
+        <w:ind w:right="0" w:left="0" w:firstLine="0"/>
+        <w:jc w:val="both"/>
+        <w:rPr>
+          <w:rFonts w:ascii="Calibri" w:hAnsi="Calibri" w:cs="Calibri" w:eastAsia="Calibri"/>
+          <w:color w:val="000000"/>
+          <w:spacing w:val="0"/>
+          <w:position w:val="0"/>
+          <w:sz w:val="21"/>
+          <w:shd w:fill="auto" w:val="clear"/>
+        </w:rPr>
+      </w:pPr>
+    </w:p>
+    <w:p>
+      <w:pPr>
+        <w:spacing w:before="0" w:after="0" w:line="240"/>
+        <w:ind w:right="0" w:left="0" w:firstLine="0"/>
+        <w:jc w:val="both"/>
+        <w:rPr>
+          <w:rFonts w:ascii="Calibri" w:hAnsi="Calibri" w:cs="Calibri" w:eastAsia="Calibri"/>
+          <w:color w:val="000000"/>
+          <w:spacing w:val="0"/>
+          <w:position w:val="0"/>
+          <w:sz w:val="21"/>
+          <w:shd w:fill="auto" w:val="clear"/>
+        </w:rPr>
+      </w:pPr>
+    </w:p>
+    <w:p>
+      <w:pPr>
+        <w:spacing w:before="0" w:after="0" w:line="240"/>
+        <w:ind w:right="0" w:left="0" w:firstLine="0"/>
+        <w:jc w:val="both"/>
+        <w:rPr>
+          <w:rFonts w:ascii="Calibri" w:hAnsi="Calibri" w:cs="Calibri" w:eastAsia="Calibri"/>
+          <w:color w:val="000000"/>
+          <w:spacing w:val="0"/>
+          <w:position w:val="0"/>
+          <w:sz w:val="21"/>
+          <w:shd w:fill="auto" w:val="clear"/>
+        </w:rPr>
+      </w:pPr>
+    </w:p>
+    <w:p>
+      <w:pPr>
+        <w:spacing w:before="0" w:after="0" w:line="240"/>
+        <w:ind w:right="0" w:left="0" w:firstLine="0"/>
+        <w:jc w:val="both"/>
+        <w:rPr>
+          <w:rFonts w:ascii="Calibri" w:hAnsi="Calibri" w:cs="Calibri" w:eastAsia="Calibri"/>
+          <w:color w:val="000000"/>
+          <w:spacing w:val="0"/>
+          <w:position w:val="0"/>
+          <w:sz w:val="21"/>
+          <w:shd w:fill="auto" w:val="clear"/>
+        </w:rPr>
+      </w:pPr>
+    </w:p>
+    <w:p>
+      <w:pPr>
+        <w:numPr>
+          <w:ilvl w:val="0"/>
+          <w:numId w:val="15"/>
         </w:numPr>
         <w:spacing w:before="0" w:after="0" w:line="240"/>
         <w:ind w:right="0" w:left="0" w:firstLine="0"/>
@@ -1314,13 +1310,13 @@
   <w:num w:numId="5">
     <w:abstractNumId w:val="18"/>
   </w:num>
-  <w:num w:numId="8">
+  <w:num w:numId="10">
     <w:abstractNumId w:val="12"/>
   </w:num>
-  <w:num w:numId="10">
+  <w:num w:numId="12">
     <w:abstractNumId w:val="6"/>
   </w:num>
-  <w:num w:numId="13">
+  <w:num w:numId="15">
     <w:abstractNumId w:val="0"/>
   </w:num>
 </w:numbering>

</xml_diff>